<commit_message>
Add batch 3 (topics 21-30) using library sources; library-based fixes to topics 9, 10, 12
</commit_message>
<xml_diff>
--- a/Мавзу2/009.docx
+++ b/Мавзу2/009.docx
@@ -237,7 +237,7 @@
           <w:b w:val="0"/>
           <w:sz w:val="28"/>
         </w:rPr>
-        <w:t>Mikroblarning ko'pchiligi neytral yoki kuchsiz ishqoriy muhitda yaxshi ko'payadi. Bakteriyalar ichki muhit pH i ni ma'lum chegarada ushlab turish mexanizmlariga ega bo'lib, tashqi muhit pH i hujayra ichidagidan farq qilganda ham ko'payishi mumkin [6]. Shunga qaramay, har bir tur uchun optimal pH bor: vabo vibrioni boyituvchi ishqoriy pepton suvida (pH taxminan 8,6), zamburug'lar esa kislotaliroq muhitda yaxshi o'sadi [1]. Muhit pH i tayyorlash paytida va sterilizatsiyadan keyin tekshiriladi (alohida mavzuda yoritiladi). Izotoniklik uchun muhitga odatda 0,5–0,85 foiz osh tuzi qo'shiladi; stafilokokklar yuqori tuz konsentratsiyasiga chidamli, shu sababli tuzli (7,5 foiz) muhit ularni tanlab ajratishda ishlatiladi.</w:t>
+        <w:t>Mikroblarning ko'pchiligi neytral yoki kuchsiz ishqoriy muhitda yaxshi ko'payadi. Bakteriyalar ichki muhit pH i ni ma'lum chegarada ushlab turish mexanizmlariga ega bo'lib, tashqi muhit pH i hujayra ichidagidan farq qilganda ham ko'payishi mumkin [6]. Shunga qaramay, har bir tur uchun optimal pH bor: vabo vibrioni boyituvchi ishqoriy pepton suvida (pH taxminan 8,6), zamburug'lar esa kislotaliroq muhitda yaxshi o'sadi [1]. O'zbekistonda nashr etilgan darslikda ko'pchilik patogenlar uchun optimal pH 7,2–7,4, vabo vibrioni uchun 8,5–9,0, sil qo'zg'atuvchisi uchun 6,2–6,8 ekani, osmotik bosim uchun esa taxminan 0,5 foizli osh tuzi eritmasi mos kelishi ko'rsatilgan [7]. Muhit pH i tayyorlash paytida va sterilizatsiyadan keyin tekshiriladi (alohida mavzuda yoritiladi). Izotoniklik uchun muhitga odatda 0,5–0,85 foiz osh tuzi qo'shiladi; stafilokokklar yuqori tuz konsentratsiyasiga chidamli, shu sababli tuzli (7,5 foiz) muhit ularni tanlab ajratishda ishlatiladi.</w:t>
       </w:r>
     </w:p>
     <w:p>
@@ -265,7 +265,7 @@
           <w:b w:val="0"/>
           <w:sz w:val="28"/>
         </w:rPr>
-        <w:t>Aeroblar uchun muhitda erigan kislorod yetarli bo'lsa, majburiy anaeroblar uchun muhit qaytarilgan, ya'ni Eh past bo'lishi shart. Buning uchun muhitga qaytaruvchi moddalar (tioglikolat, sistein, askorbin kislotasi) qo'shiladi, yuzasi esa vazelin moyi bilan yopiladi. Rezazurin indikatori muhit oksidlanganda pushti rang beradi va uning sifatini ko'rsatadi [1]. Shaffoflik suyuq muhitda o'sishni ko'z bilan baholash uchun zarur: loyqa yoki cho'kmali muhit sterilizatsiyadan oldin filtrlanadi. Bunday muhitlarda ekilgan material o'sishi o'zgarmagan muhit bilan solishtirib baholanadi.</w:t>
+        <w:t>Aeroblar uchun muhitda erigan kislorod yetarli bo'lsa, majburiy anaeroblar uchun muhit qaytarilgan, ya'ni Eh past bo'lishi shart. Buning uchun muhitga qaytaruvchi moddalar (tioglikolat, sistein, askorbin kislotasi) qo'shiladi, yuzasi esa vazelin moyi bilan yopiladi. Rezazurin indikatori muhit oksidlanganda pushti rang beradi va uning sifatini ko'rsatadi [1]. Darslikda bu ko'rsatkich rH2 indeksi bilan ifodalanib, anaeroblar uchun u 5 dan, aeroblar uchun 10 dan past bo'lmasligi yozilgan [7]. Shaffoflik suyuq muhitda o'sishni ko'z bilan baholash uchun zarur: loyqa yoki cho'kmali muhit sterilizatsiyadan oldin filtrlanadi. Bunday muhitlarda ekilgan material o'sishi o'zgarmagan muhit bilan solishtirib baholanadi.</w:t>
       </w:r>
     </w:p>
     <w:p>
@@ -504,7 +504,7 @@
           <w:b w:val="0"/>
           <w:sz w:val="28"/>
         </w:rPr>
-        <w:t>Petri idishiga quyilgan zich muhit qotib, sirti qurigach ishlatiladi; agar qatlami bir tekis bo'lishi lozim; antibiotik sezuvchanligini aniqlash uchun muhit odatda taxminan 4 mm qalinlikda quyiladi [5].</w:t>
+        <w:t>Petri idishiga quyilgan zich muhit qotib, sirti qurigach ishlatiladi; agar qatlami bir tekis bo'lishi lozim; antibiotik sezuvchanligini aniqlash uchun muhit odatda (4,0 ± 0,5) mm qalinlikda quyiladi [8].</w:t>
       </w:r>
     </w:p>
     <w:p>
@@ -658,6 +658,34 @@
           <w:sz w:val="24"/>
         </w:rPr>
         <w:t>[6] Krulwich TA, Sachs G, Padan E. Molecular aspects of bacterial pH sensing and homeostasis. Nature Reviews Microbiology. 2011;9(5):330–343. DOI: 10.1038/nrmicro2549</w:t>
+      </w:r>
+    </w:p>
+    <w:p>
+      <w:pPr>
+        <w:spacing w:line="276" w:lineRule="auto"/>
+        <w:jc w:val="left"/>
+      </w:pPr>
+      <w:r>
+        <w:rPr>
+          <w:rFonts w:ascii="Times New Roman" w:hAnsi="Times New Roman" w:eastAsia="Times New Roman"/>
+          <w:b w:val="0"/>
+          <w:sz w:val="24"/>
+        </w:rPr>
+        <w:t>[7] G'anixo'jayeva A, Nazarova H. Mikrobiologiya: tibbiyot kollejlari va bilim yurtlari o'quvchilari uchun darslik. Toshkent: Abu Ali ibn Sino nomidagi tibbiyot nashriyoti; 2002 (kirill yozuvida). Xayrullo Komilov kutubxonasi, id 2323: https://xayrullokomilov.uz/kutubxona/2323</w:t>
+      </w:r>
+    </w:p>
+    <w:p>
+      <w:pPr>
+        <w:spacing w:line="276" w:lineRule="auto"/>
+        <w:jc w:val="left"/>
+      </w:pPr>
+      <w:r>
+        <w:rPr>
+          <w:rFonts w:ascii="Times New Roman" w:hAnsi="Times New Roman" w:eastAsia="Times New Roman"/>
+          <w:b w:val="0"/>
+          <w:sz w:val="24"/>
+        </w:rPr>
+        <w:t>[8] MUK 4.2.1890-04. Mikroorganizmlarning antibakterial preparatlarga sezuvchanligini aniqlash: uslubiy ko'rsatmalar (rus tilida). Moskva: Rossiya Sog'liqni saqlash vazirligi Davlat sanepidnazorat federal markazi; 2004 (Rossiya Federatsiyasi hujjati). Xayrullo Komilov kutubxonasi, id 1980: https://xayrullokomilov.uz/kutubxona/1980</w:t>
       </w:r>
     </w:p>
     <w:sectPr>

</xml_diff>